<commit_message>
docs: fix LaTeX math rendering conflicts with markdown underscores
</commit_message>
<xml_diff>
--- a/floodnet_segmentation_paper.docx
+++ b/floodnet_segmentation_paper.docx
@@ -497,7 +497,7 @@
           <w:i/>
           <w:color w:val="781414"/>
         </w:rPr>
-        <w:t>F_{\text{UNet}} \in \mathbb{R}^{32 \times H \times W}</w:t>
+        <w:t>F_{UNet} \in \mathbb{R}^{32 \times H \times W}</w:t>
       </w:r>
       <w:r>
         <w:rPr>
@@ -513,7 +513,7 @@
           <w:i/>
           <w:color w:val="781414"/>
         </w:rPr>
-        <w:t>F_{\text{DL}} \in \mathbb{R}^{64 \times \frac{H}{4} \times \frac{W}{4}}</w:t>
+        <w:t>F_{DL} \in \mathbb{R}^{64 \times \frac{H}{4} \times \frac{W}{4}}</w:t>
       </w:r>
       <w:r>
         <w:rPr>
@@ -529,7 +529,7 @@
           <w:i/>
           <w:color w:val="781414"/>
         </w:rPr>
-        <w:t>F_{\text{FCN}} \in \mathbb{R}^{512 \times \frac{H}{8} \times \frac{W}{8}}</w:t>
+        <w:t>F_{FCN} \in \mathbb{R}^{512 \times \frac{H}{8} \times \frac{W}{8}}</w:t>
       </w:r>
       <w:r>
         <w:rPr>
@@ -568,7 +568,7 @@
           <w:color w:val="781414"/>
           <w:sz w:val="22"/>
         </w:rPr>
-        <w:t>F_{FCN_proj = ReLU(BatchNorm(P(F_{FCN))) \in R^{64  x  /{H{8  x  /{W{8</w:t>
+        <w:t>F_{FCN-proj = ReLU(BatchNorm(P(F_{FCN))) \in R^{64  x  /{H{8  x  /{W{8</w:t>
       </w:r>
     </w:p>
     <w:p>
@@ -628,7 +628,7 @@
           <w:color w:val="781414"/>
           <w:sz w:val="22"/>
         </w:rPr>
-        <w:t>F_{concat = \left[ F_{UNet \;\|\; U(F_{DL) \;\|\; U(F_{FCN_proj) \right] \in R^{160  x  H  x  W</w:t>
+        <w:t>F_{concat = \left[ F_{UNet \;\|\; U(F_{DL) \;\|\; U(F_{FCN-proj) \right] \in R^{160  x  H  x  W</w:t>
       </w:r>
     </w:p>
     <w:p>
@@ -985,7 +985,7 @@
           <w:i/>
           <w:color w:val="781414"/>
         </w:rPr>
-        <w:t>\mathcal{L}_{\text{hybrid}}</w:t>
+        <w:t>\mathcal{L}_{hybrid}</w:t>
       </w:r>
       <w:r>
         <w:rPr>
@@ -1116,7 +1116,7 @@
           <w:i/>
           <w:color w:val="781414"/>
         </w:rPr>
-        <w:t>P_{\text{syn}}</w:t>
+        <w:t>P_{syn}</w:t>
       </w:r>
       <w:r>
         <w:rPr>
@@ -1132,7 +1132,7 @@
           <w:i/>
           <w:color w:val="781414"/>
         </w:rPr>
-        <w:t>P_{\text{meta}}</w:t>
+        <w:t>P_{meta}</w:t>
       </w:r>
       <w:r>
         <w:rPr>
@@ -1265,7 +1265,7 @@
           <w:b w:val="0"/>
           <w:i w:val="0"/>
         </w:rPr>
-        <w:t>\text{argmax}_c P_{\text{blend}}(c) &amp; \text{if } \max_c P_{\text{blend}}(c) \ge t_c \\</w:t>
+        <w:t>\text{argmax}_c P_{blend}(c) &amp; \text{if } \max_c P_{blend}(c) \ge t_c \\</w:t>
       </w:r>
     </w:p>
     <w:p>
@@ -1278,7 +1278,7 @@
           <w:b w:val="0"/>
           <w:i w:val="0"/>
         </w:rPr>
-        <w:t>\text{argmax}_{k \in \mathcal{K}_{\text{fallback}}} P_{\text{blend}}(k) &amp; \text{otherwise}</w:t>
+        <w:t>\text{argmax}_{k \in \mathcal{K}_{fallback}} P_{blend}(k) &amp; \text{otherwise}</w:t>
       </w:r>
     </w:p>
     <w:p>
@@ -2577,7 +2577,7 @@
                 <w:color w:val="FFFFFF"/>
                 <w:sz w:val="20"/>
               </w:rPr>
-              <w:t>Blending Weight ($w_{\text{syn}}$)</w:t>
+              <w:t>Blending Weight ($w_{syn}$)</w:t>
             </w:r>
           </w:p>
         </w:tc>

</xml_diff>